<commit_message>
m1421 datasheet: keep the newest revision on one page
</commit_message>
<xml_diff>
--- a/word/datasheet_adsbee_m1421.docx
+++ b/word/datasheet_adsbee_m1421.docx
@@ -7789,6 +7789,9 @@
       </w:r>
     </w:p>
     <w:p>
+      <w:pPr>
+        <w:keepNext/>
+      </w:pPr>
       <w:r>
         <w:t>20261013</w:t>
       </w:r>
@@ -7796,6 +7799,7 @@
     <w:p>
       <w:pPr>
         <w:pStyle w:val="ListParagraph"/>
+        <w:keepNext/>
         <w:numPr>
           <w:ilvl w:val="0"/>
           <w:numId w:val="5"/>

</xml_diff>

<commit_message>
m1421 datasheet: table of contents page numbers match the export
</commit_message>
<xml_diff>
--- a/word/datasheet_adsbee_m1421.docx
+++ b/word/datasheet_adsbee_m1421.docx
@@ -869,7 +869,7 @@
                 <w:noProof/>
                 <w:webHidden/>
               </w:rPr>
-              <w:t>6</w:t>
+              <w:t>5</w:t>
             </w:r>
             <w:r>
               <w:rPr>
@@ -959,7 +959,7 @@
                 <w:noProof/>
                 <w:webHidden/>
               </w:rPr>
-              <w:t>7</w:t>
+              <w:t>6</w:t>
             </w:r>
             <w:r>
               <w:rPr>
@@ -1049,7 +1049,7 @@
                 <w:noProof/>
                 <w:webHidden/>
               </w:rPr>
-              <w:t>8</w:t>
+              <w:t>7</w:t>
             </w:r>
             <w:r>
               <w:rPr>
@@ -1139,7 +1139,7 @@
                 <w:noProof/>
                 <w:webHidden/>
               </w:rPr>
-              <w:t>9</w:t>
+              <w:t>8</w:t>
             </w:r>
             <w:r>
               <w:rPr>
@@ -1229,7 +1229,7 @@
                 <w:noProof/>
                 <w:webHidden/>
               </w:rPr>
-              <w:t>9</w:t>
+              <w:t>8</w:t>
             </w:r>
             <w:r>
               <w:rPr>
@@ -1319,7 +1319,7 @@
                 <w:noProof/>
                 <w:webHidden/>
               </w:rPr>
-              <w:t>10</w:t>
+              <w:t>9</w:t>
             </w:r>
             <w:r>
               <w:rPr>
@@ -1409,7 +1409,7 @@
                 <w:noProof/>
                 <w:webHidden/>
               </w:rPr>
-              <w:t>11</w:t>
+              <w:t>10</w:t>
             </w:r>
             <w:r>
               <w:rPr>
@@ -1499,7 +1499,7 @@
                 <w:noProof/>
                 <w:webHidden/>
               </w:rPr>
-              <w:t>11</w:t>
+              <w:t>10</w:t>
             </w:r>
             <w:r>
               <w:rPr>
@@ -1589,7 +1589,7 @@
                 <w:noProof/>
                 <w:webHidden/>
               </w:rPr>
-              <w:t>11</w:t>
+              <w:t>10</w:t>
             </w:r>
             <w:r>
               <w:rPr>
@@ -1679,7 +1679,7 @@
                 <w:noProof/>
                 <w:webHidden/>
               </w:rPr>
-              <w:t>11</w:t>
+              <w:t>10</w:t>
             </w:r>
             <w:r>
               <w:rPr>
@@ -1769,7 +1769,7 @@
                 <w:noProof/>
                 <w:webHidden/>
               </w:rPr>
-              <w:t>12</w:t>
+              <w:t>11</w:t>
             </w:r>
             <w:r>
               <w:rPr>
@@ -1859,7 +1859,7 @@
                 <w:noProof/>
                 <w:webHidden/>
               </w:rPr>
-              <w:t>12</w:t>
+              <w:t>11</w:t>
             </w:r>
             <w:r>
               <w:rPr>
@@ -1949,7 +1949,7 @@
                 <w:noProof/>
                 <w:webHidden/>
               </w:rPr>
-              <w:t>12</w:t>
+              <w:t>11</w:t>
             </w:r>
             <w:r>
               <w:rPr>
@@ -2039,7 +2039,7 @@
                 <w:noProof/>
                 <w:webHidden/>
               </w:rPr>
-              <w:t>13</w:t>
+              <w:t>12</w:t>
             </w:r>
             <w:r>
               <w:rPr>
@@ -2129,7 +2129,7 @@
                 <w:noProof/>
                 <w:webHidden/>
               </w:rPr>
-              <w:t>14</w:t>
+              <w:t>13</w:t>
             </w:r>
             <w:r>
               <w:rPr>
@@ -2219,7 +2219,7 @@
                 <w:noProof/>
                 <w:webHidden/>
               </w:rPr>
-              <w:t>15</w:t>
+              <w:t>14</w:t>
             </w:r>
             <w:r>
               <w:rPr>
@@ -2309,7 +2309,7 @@
                 <w:noProof/>
                 <w:webHidden/>
               </w:rPr>
-              <w:t>15</w:t>
+              <w:t>14</w:t>
             </w:r>
             <w:r>
               <w:rPr>
@@ -2399,7 +2399,7 @@
                 <w:noProof/>
                 <w:webHidden/>
               </w:rPr>
-              <w:t>15</w:t>
+              <w:t>14</w:t>
             </w:r>
             <w:r>
               <w:rPr>
@@ -2489,7 +2489,7 @@
                 <w:noProof/>
                 <w:webHidden/>
               </w:rPr>
-              <w:t>16</w:t>
+              <w:t>15</w:t>
             </w:r>
             <w:r>
               <w:rPr>
@@ -2579,7 +2579,7 @@
                 <w:noProof/>
                 <w:webHidden/>
               </w:rPr>
-              <w:t>16</w:t>
+              <w:t>15</w:t>
             </w:r>
             <w:r>
               <w:rPr>
@@ -2669,7 +2669,7 @@
                 <w:noProof/>
                 <w:webHidden/>
               </w:rPr>
-              <w:t>16</w:t>
+              <w:t>15</w:t>
             </w:r>
             <w:r>
               <w:rPr>
@@ -2759,7 +2759,7 @@
                 <w:noProof/>
                 <w:webHidden/>
               </w:rPr>
-              <w:t>17</w:t>
+              <w:t>16</w:t>
             </w:r>
             <w:r>
               <w:rPr>
@@ -2849,7 +2849,7 @@
                 <w:noProof/>
                 <w:webHidden/>
               </w:rPr>
-              <w:t>17</w:t>
+              <w:t>16</w:t>
             </w:r>
             <w:r>
               <w:rPr>
@@ -2939,7 +2939,7 @@
                 <w:noProof/>
                 <w:webHidden/>
               </w:rPr>
-              <w:t>17</w:t>
+              <w:t>16</w:t>
             </w:r>
             <w:r>
               <w:rPr>
@@ -3029,7 +3029,7 @@
                 <w:noProof/>
                 <w:webHidden/>
               </w:rPr>
-              <w:t>17</w:t>
+              <w:t>16</w:t>
             </w:r>
             <w:r>
               <w:rPr>
@@ -3119,7 +3119,7 @@
                 <w:noProof/>
                 <w:webHidden/>
               </w:rPr>
-              <w:t>17</w:t>
+              <w:t>16</w:t>
             </w:r>
             <w:r>
               <w:rPr>
@@ -3209,7 +3209,7 @@
                 <w:noProof/>
                 <w:webHidden/>
               </w:rPr>
-              <w:t>17</w:t>
+              <w:t>16</w:t>
             </w:r>
             <w:r>
               <w:rPr>
@@ -3299,7 +3299,7 @@
                 <w:noProof/>
                 <w:webHidden/>
               </w:rPr>
-              <w:t>18</w:t>
+              <w:t>17</w:t>
             </w:r>
             <w:r>
               <w:rPr>
@@ -3389,7 +3389,7 @@
                 <w:noProof/>
                 <w:webHidden/>
               </w:rPr>
-              <w:t>18</w:t>
+              <w:t>17</w:t>
             </w:r>
             <w:r>
               <w:rPr>
@@ -3479,7 +3479,7 @@
                 <w:noProof/>
                 <w:webHidden/>
               </w:rPr>
-              <w:t>18</w:t>
+              <w:t>17</w:t>
             </w:r>
             <w:r>
               <w:rPr>
@@ -3569,7 +3569,7 @@
                 <w:noProof/>
                 <w:webHidden/>
               </w:rPr>
-              <w:t>19</w:t>
+              <w:t>18</w:t>
             </w:r>
             <w:r>
               <w:rPr>
@@ -3659,7 +3659,7 @@
                 <w:noProof/>
                 <w:webHidden/>
               </w:rPr>
-              <w:t>19</w:t>
+              <w:t>18</w:t>
             </w:r>
             <w:r>
               <w:rPr>
@@ -3749,7 +3749,7 @@
                 <w:noProof/>
                 <w:webHidden/>
               </w:rPr>
-              <w:t>19</w:t>
+              <w:t>18</w:t>
             </w:r>
             <w:r>
               <w:rPr>
@@ -3839,7 +3839,7 @@
                 <w:noProof/>
                 <w:webHidden/>
               </w:rPr>
-              <w:t>20</w:t>
+              <w:t>19</w:t>
             </w:r>
             <w:r>
               <w:rPr>
@@ -3929,7 +3929,7 @@
                 <w:noProof/>
                 <w:webHidden/>
               </w:rPr>
-              <w:t>21</w:t>
+              <w:t>20</w:t>
             </w:r>
             <w:r>
               <w:rPr>
@@ -4019,7 +4019,7 @@
                 <w:noProof/>
                 <w:webHidden/>
               </w:rPr>
-              <w:t>21</w:t>
+              <w:t>20</w:t>
             </w:r>
             <w:r>
               <w:rPr>
@@ -4109,7 +4109,7 @@
                 <w:noProof/>
                 <w:webHidden/>
               </w:rPr>
-              <w:t>21</w:t>
+              <w:t>20</w:t>
             </w:r>
             <w:r>
               <w:rPr>
@@ -4199,7 +4199,7 @@
                 <w:noProof/>
                 <w:webHidden/>
               </w:rPr>
-              <w:t>22</w:t>
+              <w:t>21</w:t>
             </w:r>
             <w:r>
               <w:rPr>
@@ -4289,7 +4289,7 @@
                 <w:noProof/>
                 <w:webHidden/>
               </w:rPr>
-              <w:t>22</w:t>
+              <w:t>21</w:t>
             </w:r>
             <w:r>
               <w:rPr>
@@ -4379,7 +4379,7 @@
                 <w:noProof/>
                 <w:webHidden/>
               </w:rPr>
-              <w:t>22</w:t>
+              <w:t>21</w:t>
             </w:r>
             <w:r>
               <w:rPr>
@@ -4469,7 +4469,7 @@
                 <w:noProof/>
                 <w:webHidden/>
               </w:rPr>
-              <w:t>24</w:t>
+              <w:t>23</w:t>
             </w:r>
             <w:r>
               <w:rPr>
@@ -4559,7 +4559,7 @@
                 <w:noProof/>
                 <w:webHidden/>
               </w:rPr>
-              <w:t>25</w:t>
+              <w:t>24</w:t>
             </w:r>
             <w:r>
               <w:rPr>
@@ -4649,7 +4649,7 @@
                 <w:noProof/>
                 <w:webHidden/>
               </w:rPr>
-              <w:t>25</w:t>
+              <w:t>24</w:t>
             </w:r>
             <w:r>
               <w:rPr>
@@ -4739,7 +4739,7 @@
                 <w:noProof/>
                 <w:webHidden/>
               </w:rPr>
-              <w:t>25</w:t>
+              <w:t>24</w:t>
             </w:r>
             <w:r>
               <w:rPr>
@@ -4829,7 +4829,7 @@
                 <w:noProof/>
                 <w:webHidden/>
               </w:rPr>
-              <w:t>25</w:t>
+              <w:t>24</w:t>
             </w:r>
             <w:r>
               <w:rPr>
@@ -4919,7 +4919,7 @@
                 <w:noProof/>
                 <w:webHidden/>
               </w:rPr>
-              <w:t>25</w:t>
+              <w:t>24</w:t>
             </w:r>
             <w:r>
               <w:rPr>
@@ -5009,7 +5009,7 @@
                 <w:noProof/>
                 <w:webHidden/>
               </w:rPr>
-              <w:t>25</w:t>
+              <w:t>24</w:t>
             </w:r>
             <w:r>
               <w:rPr>
@@ -5099,7 +5099,7 @@
                 <w:noProof/>
                 <w:webHidden/>
               </w:rPr>
-              <w:t>26</w:t>
+              <w:t>25</w:t>
             </w:r>
             <w:r>
               <w:rPr>
@@ -5189,7 +5189,7 @@
                 <w:noProof/>
                 <w:webHidden/>
               </w:rPr>
-              <w:t>26</w:t>
+              <w:t>25</w:t>
             </w:r>
             <w:r>
               <w:rPr>
@@ -5279,7 +5279,7 @@
                 <w:noProof/>
                 <w:webHidden/>
               </w:rPr>
-              <w:t>26</w:t>
+              <w:t>25</w:t>
             </w:r>
             <w:r>
               <w:rPr>
@@ -5369,7 +5369,7 @@
                 <w:noProof/>
                 <w:webHidden/>
               </w:rPr>
-              <w:t>27</w:t>
+              <w:t>26</w:t>
             </w:r>
             <w:r>
               <w:rPr>
@@ -5459,7 +5459,7 @@
                 <w:noProof/>
                 <w:webHidden/>
               </w:rPr>
-              <w:t>27</w:t>
+              <w:t>26</w:t>
             </w:r>
             <w:r>
               <w:rPr>
@@ -5549,7 +5549,7 @@
                 <w:noProof/>
                 <w:webHidden/>
               </w:rPr>
-              <w:t>27</w:t>
+              <w:t>26</w:t>
             </w:r>
             <w:r>
               <w:rPr>
@@ -5639,7 +5639,7 @@
                 <w:noProof/>
                 <w:webHidden/>
               </w:rPr>
-              <w:t>27</w:t>
+              <w:t>26</w:t>
             </w:r>
             <w:r>
               <w:rPr>
@@ -5729,7 +5729,7 @@
                 <w:noProof/>
                 <w:webHidden/>
               </w:rPr>
-              <w:t>28</w:t>
+              <w:t>27</w:t>
             </w:r>
             <w:r>
               <w:rPr>
@@ -5819,7 +5819,7 @@
                 <w:noProof/>
                 <w:webHidden/>
               </w:rPr>
-              <w:t>29</w:t>
+              <w:t>28</w:t>
             </w:r>
             <w:r>
               <w:rPr>
@@ -5909,7 +5909,7 @@
                 <w:noProof/>
                 <w:webHidden/>
               </w:rPr>
-              <w:t>29</w:t>
+              <w:t>28</w:t>
             </w:r>
             <w:r>
               <w:rPr>
@@ -5999,7 +5999,7 @@
                 <w:noProof/>
                 <w:webHidden/>
               </w:rPr>
-              <w:t>30</w:t>
+              <w:t>29</w:t>
             </w:r>
             <w:r>
               <w:rPr>
@@ -6089,7 +6089,7 @@
                 <w:noProof/>
                 <w:webHidden/>
               </w:rPr>
-              <w:t>37</w:t>
+              <w:t>36</w:t>
             </w:r>
             <w:r>
               <w:rPr>
@@ -6179,7 +6179,7 @@
                 <w:noProof/>
                 <w:webHidden/>
               </w:rPr>
-              <w:t>39</w:t>
+              <w:t>38</w:t>
             </w:r>
             <w:r>
               <w:rPr>
@@ -6269,7 +6269,7 @@
                 <w:noProof/>
                 <w:webHidden/>
               </w:rPr>
-              <w:t>40</w:t>
+              <w:t>39</w:t>
             </w:r>
             <w:r>
               <w:rPr>
@@ -6359,7 +6359,7 @@
                 <w:noProof/>
                 <w:webHidden/>
               </w:rPr>
-              <w:t>41</w:t>
+              <w:t>40</w:t>
             </w:r>
             <w:r>
               <w:rPr>
@@ -6482,7 +6482,7 @@
                 <w:noProof/>
                 <w:webHidden/>
               </w:rPr>
-              <w:t>41</w:t>
+              <w:t>40</w:t>
             </w:r>
             <w:r>
               <w:rPr>
@@ -6572,7 +6572,7 @@
                 <w:noProof/>
                 <w:webHidden/>
               </w:rPr>
-              <w:t>41</w:t>
+              <w:t>40</w:t>
             </w:r>
             <w:r>
               <w:rPr>
@@ -6662,7 +6662,7 @@
                 <w:noProof/>
                 <w:webHidden/>
               </w:rPr>
-              <w:t>42</w:t>
+              <w:t>41</w:t>
             </w:r>
             <w:r>
               <w:rPr>
@@ -6752,7 +6752,7 @@
                 <w:noProof/>
                 <w:webHidden/>
               </w:rPr>
-              <w:t>42</w:t>
+              <w:t>41</w:t>
             </w:r>
             <w:r>
               <w:rPr>
@@ -6842,7 +6842,7 @@
                 <w:noProof/>
                 <w:webHidden/>
               </w:rPr>
-              <w:t>43</w:t>
+              <w:t>42</w:t>
             </w:r>
             <w:r>
               <w:rPr>
@@ -6932,7 +6932,7 @@
                 <w:noProof/>
                 <w:webHidden/>
               </w:rPr>
-              <w:t>43</w:t>
+              <w:t>42</w:t>
             </w:r>
             <w:r>
               <w:rPr>
@@ -7022,7 +7022,7 @@
                 <w:noProof/>
                 <w:webHidden/>
               </w:rPr>
-              <w:t>43</w:t>
+              <w:t>42</w:t>
             </w:r>
             <w:r>
               <w:rPr>
@@ -7112,7 +7112,7 @@
                 <w:noProof/>
                 <w:webHidden/>
               </w:rPr>
-              <w:t>44</w:t>
+              <w:t>43</w:t>
             </w:r>
             <w:r>
               <w:rPr>
@@ -7202,7 +7202,7 @@
                 <w:noProof/>
                 <w:webHidden/>
               </w:rPr>
-              <w:t>44</w:t>
+              <w:t>43</w:t>
             </w:r>
             <w:r>
               <w:rPr>
@@ -7292,7 +7292,7 @@
                 <w:noProof/>
                 <w:webHidden/>
               </w:rPr>
-              <w:t>44</w:t>
+              <w:t>43</w:t>
             </w:r>
             <w:r>
               <w:rPr>
@@ -7382,7 +7382,7 @@
                 <w:noProof/>
                 <w:webHidden/>
               </w:rPr>
-              <w:t>45</w:t>
+              <w:t>44</w:t>
             </w:r>
             <w:r>
               <w:rPr>
@@ -7472,7 +7472,7 @@
                 <w:noProof/>
                 <w:webHidden/>
               </w:rPr>
-              <w:t>46</w:t>
+              <w:t>45</w:t>
             </w:r>
             <w:r>
               <w:rPr>
@@ -7562,7 +7562,7 @@
                 <w:noProof/>
                 <w:webHidden/>
               </w:rPr>
-              <w:t>46</w:t>
+              <w:t>45</w:t>
             </w:r>
             <w:r>
               <w:rPr>
@@ -7652,7 +7652,7 @@
                 <w:noProof/>
                 <w:webHidden/>
               </w:rPr>
-              <w:t>47</w:t>
+              <w:t>46</w:t>
             </w:r>
             <w:r>
               <w:rPr>

</xml_diff>

<commit_message>
m1421 datasheet: fix interval_us note in MESSAGE_INTERVAL (4.3.4)
</commit_message>
<xml_diff>
--- a/word/datasheet_adsbee_m1421.docx
+++ b/word/datasheet_adsbee_m1421.docx
@@ -7848,7 +7848,7 @@
         <w:keepNext/>
       </w:pPr>
       <w:r>
-        <w:t>20261013</w:t>
+        <w:t>20261015</w:t>
       </w:r>
     </w:p>
     <w:p>
@@ -7880,6 +7880,7 @@
     <w:p>
       <w:pPr>
         <w:pStyle w:val="ListParagraph"/>
+        <w:keepNext/>
         <w:numPr>
           <w:ilvl w:val="0"/>
           <w:numId w:val="5"/>
@@ -7887,6 +7888,18 @@
       </w:pPr>
       <w:r>
         <w:t>Added AT+CONFIG_HASH for comparing the settings, CCFG and firmware image of a module with a reference module.</w:t>
+      </w:r>
+    </w:p>
+    <w:p>
+      <w:pPr>
+        <w:pStyle w:val="ListParagraph"/>
+        <w:numPr>
+          <w:ilvl w:val="0"/>
+          <w:numId w:val="5"/>
+        </w:numPr>
+      </w:pPr>
+      <w:r>
+        <w:t>Corrected the note in the MAVLINK MESSAGE_INTERVAL packet definition: interval_us is always 1000 us.</w:t>
       </w:r>
     </w:p>
     <w:p>
@@ -30268,7 +30281,7 @@
               <w:rPr>
                 <w:lang w:eastAsia="zh-CN"/>
               </w:rPr>
-              <w:t>NOTE: For ADSBee m1421, message_id is always 1000 us.</w:t>
+              <w:t>NOTE: For ADSBee m1421, interval_us is always 1000 us.</w:t>
             </w:r>
           </w:p>
         </w:tc>
@@ -37283,7 +37296,7 @@
       <w:rPr>
         <w:color w:val="FFFFFF" w:themeColor="background1"/>
       </w:rPr>
-      <w:t>013</w:t>
+      <w:t>015</w:t>
     </w:r>
     <w:r>
       <w:rPr>

</xml_diff>

<commit_message>
m1421 datasheet: fix interval_us note in 4.3.4 (#339)
* m1421 datasheet: fix interval_us note in MESSAGE_INTERVAL (4.3.4)

* word: export PDFs

word/exports/datasheet_adsbee_m1421.pdf

---------

Co-authored-by: github-actions[bot] <41898282+github-actions[bot]@users.noreply.github.com>
</commit_message>
<xml_diff>
--- a/word/datasheet_adsbee_m1421.docx
+++ b/word/datasheet_adsbee_m1421.docx
@@ -7848,7 +7848,7 @@
         <w:keepNext/>
       </w:pPr>
       <w:r>
-        <w:t>20261013</w:t>
+        <w:t>20261015</w:t>
       </w:r>
     </w:p>
     <w:p>
@@ -7880,6 +7880,7 @@
     <w:p>
       <w:pPr>
         <w:pStyle w:val="ListParagraph"/>
+        <w:keepNext/>
         <w:numPr>
           <w:ilvl w:val="0"/>
           <w:numId w:val="5"/>
@@ -7887,6 +7888,18 @@
       </w:pPr>
       <w:r>
         <w:t>Added AT+CONFIG_HASH for comparing the settings, CCFG and firmware image of a module with a reference module.</w:t>
+      </w:r>
+    </w:p>
+    <w:p>
+      <w:pPr>
+        <w:pStyle w:val="ListParagraph"/>
+        <w:numPr>
+          <w:ilvl w:val="0"/>
+          <w:numId w:val="5"/>
+        </w:numPr>
+      </w:pPr>
+      <w:r>
+        <w:t>Corrected the note in the MAVLINK MESSAGE_INTERVAL packet definition: interval_us is always 1000 us.</w:t>
       </w:r>
     </w:p>
     <w:p>
@@ -30268,7 +30281,7 @@
               <w:rPr>
                 <w:lang w:eastAsia="zh-CN"/>
               </w:rPr>
-              <w:t>NOTE: For ADSBee m1421, message_id is always 1000 us.</w:t>
+              <w:t>NOTE: For ADSBee m1421, interval_us is always 1000 us.</w:t>
             </w:r>
           </w:p>
         </w:tc>
@@ -37283,7 +37296,7 @@
       <w:rPr>
         <w:color w:val="FFFFFF" w:themeColor="background1"/>
       </w:rPr>
-      <w:t>013</w:t>
+      <w:t>015</w:t>
     </w:r>
     <w:r>
       <w:rPr>

</xml_diff>